<commit_message>
MAJ README (structure Notebook/), notebooks re-executes et rapport actualise
</commit_message>
<xml_diff>
--- a/Rapport_Projet_Deep_Learning.docx
+++ b/Rapport_Projet_Deep_Learning.docx
@@ -465,6 +465,12 @@
           <w:lang w:val="fr-FR"/>
         </w:rPr>
       </w:pPr>
+      <w:r>
+        <w:rPr>
+          <w:lang w:val="fr-FR"/>
+        </w:rPr>
+        <w:t xml:space="preserve"> </w:t>
+      </w:r>
     </w:p>
     <w:p>
       <w:pPr>
@@ -1712,12 +1718,6 @@
           <w:rFonts w:ascii="Times New Roman" w:hAnsi="Times New Roman" w:cs="Times New Roman"/>
         </w:rPr>
       </w:pPr>
-      <w:r>
-        <w:rPr>
-          <w:rFonts w:ascii="Times New Roman" w:hAnsi="Times New Roman" w:cs="Times New Roman"/>
-        </w:rPr>
-        <w:br w:type="page"/>
-      </w:r>
     </w:p>
     <w:p>
       <w:pPr>
@@ -1728,22 +1728,12 @@
         </w:rPr>
       </w:pPr>
       <w:bookmarkStart w:id="2" w:name="_Toc232519536"/>
-      <w:proofErr w:type="spellStart"/>
-      <w:r>
-        <w:rPr>
-          <w:rFonts w:ascii="Times New Roman" w:hAnsi="Times New Roman" w:cs="Times New Roman"/>
-          <w:lang w:val="fr-FR"/>
-        </w:rPr>
-        <w:lastRenderedPageBreak/>
-        <w:t>Listes</w:t>
-      </w:r>
-      <w:proofErr w:type="spellEnd"/>
-      <w:r>
-        <w:rPr>
-          <w:rFonts w:ascii="Times New Roman" w:hAnsi="Times New Roman" w:cs="Times New Roman"/>
-          <w:lang w:val="fr-FR"/>
-        </w:rPr>
-        <w:t xml:space="preserve"> des figures</w:t>
+      <w:r>
+        <w:rPr>
+          <w:rFonts w:ascii="Times New Roman" w:hAnsi="Times New Roman" w:cs="Times New Roman"/>
+          <w:lang w:val="fr-FR"/>
+        </w:rPr>
+        <w:t>Listes des figures</w:t>
       </w:r>
       <w:bookmarkEnd w:id="2"/>
     </w:p>
@@ -2493,22 +2483,12 @@
         </w:rPr>
       </w:pPr>
       <w:bookmarkStart w:id="3" w:name="_Toc232519537"/>
-      <w:proofErr w:type="spellStart"/>
-      <w:r>
-        <w:rPr>
-          <w:rFonts w:ascii="Times New Roman" w:hAnsi="Times New Roman" w:cs="Times New Roman"/>
-          <w:lang w:val="fr-FR"/>
-        </w:rPr>
-        <w:lastRenderedPageBreak/>
-        <w:t>Listes</w:t>
-      </w:r>
-      <w:proofErr w:type="spellEnd"/>
-      <w:r>
-        <w:rPr>
-          <w:rFonts w:ascii="Times New Roman" w:hAnsi="Times New Roman" w:cs="Times New Roman"/>
-          <w:lang w:val="fr-FR"/>
-        </w:rPr>
-        <w:t xml:space="preserve"> des tableaux</w:t>
+      <w:r>
+        <w:rPr>
+          <w:rFonts w:ascii="Times New Roman" w:hAnsi="Times New Roman" w:cs="Times New Roman"/>
+          <w:lang w:val="fr-FR"/>
+        </w:rPr>
+        <w:t>Listes des tableaux</w:t>
       </w:r>
       <w:bookmarkEnd w:id="3"/>
     </w:p>
@@ -3003,49 +2983,15 @@
         </w:rPr>
       </w:pPr>
       <w:bookmarkStart w:id="4" w:name="_Toc232519538"/>
-      <w:proofErr w:type="spellStart"/>
       <w:r>
         <w:rPr>
           <w:rFonts w:ascii="Times New Roman" w:hAnsi="Times New Roman" w:cs="Times New Roman"/>
           <w:lang w:val="fr-FR"/>
         </w:rPr>
         <w:lastRenderedPageBreak/>
-        <w:t>Liste</w:t>
-      </w:r>
-      <w:proofErr w:type="spellEnd"/>
-      <w:r>
-        <w:rPr>
-          <w:rFonts w:ascii="Times New Roman" w:hAnsi="Times New Roman" w:cs="Times New Roman"/>
-          <w:lang w:val="fr-FR"/>
-        </w:rPr>
-        <w:t xml:space="preserve"> des </w:t>
-      </w:r>
-      <w:proofErr w:type="spellStart"/>
-      <w:r>
-        <w:rPr>
-          <w:rFonts w:ascii="Times New Roman" w:hAnsi="Times New Roman" w:cs="Times New Roman"/>
-          <w:lang w:val="fr-FR"/>
-        </w:rPr>
-        <w:t>abréviations</w:t>
-      </w:r>
-      <w:proofErr w:type="spellEnd"/>
-      <w:r>
-        <w:rPr>
-          <w:rFonts w:ascii="Times New Roman" w:hAnsi="Times New Roman" w:cs="Times New Roman"/>
-          <w:lang w:val="fr-FR"/>
-        </w:rPr>
-        <w:t xml:space="preserve"> et </w:t>
-      </w:r>
-      <w:proofErr w:type="spellStart"/>
-      <w:r>
-        <w:rPr>
-          <w:rFonts w:ascii="Times New Roman" w:hAnsi="Times New Roman" w:cs="Times New Roman"/>
-          <w:lang w:val="fr-FR"/>
-        </w:rPr>
-        <w:t>sigles</w:t>
+        <w:t>Liste des abréviations et sigles</w:t>
       </w:r>
       <w:bookmarkEnd w:id="4"/>
-      <w:proofErr w:type="spellEnd"/>
     </w:p>
     <w:tbl>
       <w:tblPr>
@@ -4767,8 +4713,8 @@
           <w:lang w:val="fr-FR"/>
         </w:rPr>
       </w:pPr>
-      <w:bookmarkStart w:id="5" w:name="introduction"/>
-      <w:bookmarkStart w:id="6" w:name="_Toc232519539"/>
+      <w:bookmarkStart w:id="5" w:name="_Toc232519539"/>
+      <w:bookmarkStart w:id="6" w:name="introduction"/>
       <w:bookmarkEnd w:id="1"/>
       <w:r>
         <w:rPr>
@@ -4778,185 +4724,185 @@
         <w:lastRenderedPageBreak/>
         <w:t>1. Introduction</w:t>
       </w:r>
+      <w:bookmarkEnd w:id="5"/>
+    </w:p>
+    <w:p>
+      <w:pPr>
+        <w:pStyle w:val="FirstParagraph"/>
+        <w:rPr>
+          <w:rFonts w:ascii="Times New Roman" w:hAnsi="Times New Roman" w:cs="Times New Roman"/>
+          <w:lang w:val="fr-FR"/>
+        </w:rPr>
+      </w:pPr>
+      <w:r>
+        <w:rPr>
+          <w:rFonts w:ascii="Times New Roman" w:hAnsi="Times New Roman" w:cs="Times New Roman"/>
+          <w:lang w:val="fr-FR"/>
+        </w:rPr>
+        <w:t xml:space="preserve">Le </w:t>
+      </w:r>
+      <w:proofErr w:type="spellStart"/>
+      <w:r>
+        <w:rPr>
+          <w:rFonts w:ascii="Times New Roman" w:hAnsi="Times New Roman" w:cs="Times New Roman"/>
+          <w:lang w:val="fr-FR"/>
+        </w:rPr>
+        <w:t>deep</w:t>
+      </w:r>
+      <w:proofErr w:type="spellEnd"/>
+      <w:r>
+        <w:rPr>
+          <w:rFonts w:ascii="Times New Roman" w:hAnsi="Times New Roman" w:cs="Times New Roman"/>
+          <w:lang w:val="fr-FR"/>
+        </w:rPr>
+        <w:t xml:space="preserve"> </w:t>
+      </w:r>
+      <w:proofErr w:type="spellStart"/>
+      <w:r>
+        <w:rPr>
+          <w:rFonts w:ascii="Times New Roman" w:hAnsi="Times New Roman" w:cs="Times New Roman"/>
+          <w:lang w:val="fr-FR"/>
+        </w:rPr>
+        <w:t>learning</w:t>
+      </w:r>
+      <w:proofErr w:type="spellEnd"/>
+      <w:r>
+        <w:rPr>
+          <w:rFonts w:ascii="Times New Roman" w:hAnsi="Times New Roman" w:cs="Times New Roman"/>
+          <w:lang w:val="fr-FR"/>
+        </w:rPr>
+        <w:t xml:space="preserve"> a pour particularité de </w:t>
+      </w:r>
+      <w:r>
+        <w:rPr>
+          <w:rFonts w:ascii="Times New Roman" w:hAnsi="Times New Roman" w:cs="Times New Roman"/>
+          <w:b/>
+          <w:bCs/>
+          <w:lang w:val="fr-FR"/>
+        </w:rPr>
+        <w:t>construire automatiquement des représentations</w:t>
+      </w:r>
+      <w:r>
+        <w:rPr>
+          <w:rFonts w:ascii="Times New Roman" w:hAnsi="Times New Roman" w:cs="Times New Roman"/>
+          <w:lang w:val="fr-FR"/>
+        </w:rPr>
+        <w:t xml:space="preserve"> des données à partir d’exemples. Toutefois, la performance d’un réseau ne dépend pas uniquement de sa capacité : elle dépend surtout de l’</w:t>
+      </w:r>
+      <w:r>
+        <w:rPr>
+          <w:rFonts w:ascii="Times New Roman" w:hAnsi="Times New Roman" w:cs="Times New Roman"/>
+          <w:b/>
+          <w:bCs/>
+          <w:lang w:val="fr-FR"/>
+        </w:rPr>
+        <w:t>adéquation entre son architecture et la structure statistique des données</w:t>
+      </w:r>
+      <w:r>
+        <w:rPr>
+          <w:rFonts w:ascii="Times New Roman" w:hAnsi="Times New Roman" w:cs="Times New Roman"/>
+          <w:lang w:val="fr-FR"/>
+        </w:rPr>
+        <w:t xml:space="preserve">. Ce projet illustre cette idée sur trois familles de données radicalement différentes — </w:t>
+      </w:r>
+      <w:r>
+        <w:rPr>
+          <w:rFonts w:ascii="Times New Roman" w:hAnsi="Times New Roman" w:cs="Times New Roman"/>
+          <w:b/>
+          <w:bCs/>
+          <w:lang w:val="fr-FR"/>
+        </w:rPr>
+        <w:t>tabulaire</w:t>
+      </w:r>
+      <w:r>
+        <w:rPr>
+          <w:rFonts w:ascii="Times New Roman" w:hAnsi="Times New Roman" w:cs="Times New Roman"/>
+          <w:lang w:val="fr-FR"/>
+        </w:rPr>
+        <w:t xml:space="preserve">, </w:t>
+      </w:r>
+      <w:r>
+        <w:rPr>
+          <w:rFonts w:ascii="Times New Roman" w:hAnsi="Times New Roman" w:cs="Times New Roman"/>
+          <w:b/>
+          <w:bCs/>
+          <w:lang w:val="fr-FR"/>
+        </w:rPr>
+        <w:t>image</w:t>
+      </w:r>
+      <w:r>
+        <w:rPr>
+          <w:rFonts w:ascii="Times New Roman" w:hAnsi="Times New Roman" w:cs="Times New Roman"/>
+          <w:lang w:val="fr-FR"/>
+        </w:rPr>
+        <w:t xml:space="preserve"> et </w:t>
+      </w:r>
+      <w:r>
+        <w:rPr>
+          <w:rFonts w:ascii="Times New Roman" w:hAnsi="Times New Roman" w:cs="Times New Roman"/>
+          <w:b/>
+          <w:bCs/>
+          <w:lang w:val="fr-FR"/>
+        </w:rPr>
+        <w:t>séquentielle</w:t>
+      </w:r>
+      <w:r>
+        <w:rPr>
+          <w:rFonts w:ascii="Times New Roman" w:hAnsi="Times New Roman" w:cs="Times New Roman"/>
+          <w:lang w:val="fr-FR"/>
+        </w:rPr>
+        <w:t xml:space="preserve"> — en concevant, entraînant et comparant les architectures correspondantes sous </w:t>
+      </w:r>
+      <w:proofErr w:type="spellStart"/>
+      <w:r>
+        <w:rPr>
+          <w:rFonts w:ascii="Times New Roman" w:hAnsi="Times New Roman" w:cs="Times New Roman"/>
+          <w:lang w:val="fr-FR"/>
+        </w:rPr>
+        <w:t>PyTorch</w:t>
+      </w:r>
+      <w:proofErr w:type="spellEnd"/>
+      <w:r>
+        <w:rPr>
+          <w:rFonts w:ascii="Times New Roman" w:hAnsi="Times New Roman" w:cs="Times New Roman"/>
+          <w:lang w:val="fr-FR"/>
+        </w:rPr>
+        <w:t>.</w:t>
+      </w:r>
+    </w:p>
+    <w:p>
+      <w:pPr>
+        <w:pStyle w:val="BodyText"/>
+        <w:rPr>
+          <w:rFonts w:ascii="Times New Roman" w:hAnsi="Times New Roman" w:cs="Times New Roman"/>
+          <w:lang w:val="fr-FR"/>
+        </w:rPr>
+      </w:pPr>
+      <w:r>
+        <w:rPr>
+          <w:rFonts w:ascii="Times New Roman" w:hAnsi="Times New Roman" w:cs="Times New Roman"/>
+          <w:lang w:val="fr-FR"/>
+        </w:rPr>
+        <w:t>Le travail est strictement individuel et organisé en trois parties indépendantes mais cohérentes, chacune comportant une étude théorique, une implémentation, une étude expérimentale, une analyse critique et une question de synthèse sur un jeu de données réel.</w:t>
+      </w:r>
+    </w:p>
+    <w:p>
+      <w:pPr>
+        <w:pStyle w:val="Heading2"/>
+        <w:rPr>
+          <w:rFonts w:ascii="Times New Roman" w:hAnsi="Times New Roman" w:cs="Times New Roman"/>
+        </w:rPr>
+      </w:pPr>
+      <w:bookmarkStart w:id="7" w:name="_Toc232519540"/>
+      <w:bookmarkStart w:id="8" w:name="objectifs"/>
       <w:bookmarkEnd w:id="6"/>
-    </w:p>
-    <w:p>
-      <w:pPr>
-        <w:pStyle w:val="FirstParagraph"/>
-        <w:rPr>
-          <w:rFonts w:ascii="Times New Roman" w:hAnsi="Times New Roman" w:cs="Times New Roman"/>
-          <w:lang w:val="fr-FR"/>
-        </w:rPr>
-      </w:pPr>
-      <w:r>
-        <w:rPr>
-          <w:rFonts w:ascii="Times New Roman" w:hAnsi="Times New Roman" w:cs="Times New Roman"/>
-          <w:lang w:val="fr-FR"/>
-        </w:rPr>
-        <w:t xml:space="preserve">Le </w:t>
-      </w:r>
-      <w:proofErr w:type="spellStart"/>
-      <w:r>
-        <w:rPr>
-          <w:rFonts w:ascii="Times New Roman" w:hAnsi="Times New Roman" w:cs="Times New Roman"/>
-          <w:lang w:val="fr-FR"/>
-        </w:rPr>
-        <w:t>deep</w:t>
-      </w:r>
-      <w:proofErr w:type="spellEnd"/>
-      <w:r>
-        <w:rPr>
-          <w:rFonts w:ascii="Times New Roman" w:hAnsi="Times New Roman" w:cs="Times New Roman"/>
-          <w:lang w:val="fr-FR"/>
-        </w:rPr>
-        <w:t xml:space="preserve"> </w:t>
-      </w:r>
-      <w:proofErr w:type="spellStart"/>
-      <w:r>
-        <w:rPr>
-          <w:rFonts w:ascii="Times New Roman" w:hAnsi="Times New Roman" w:cs="Times New Roman"/>
-          <w:lang w:val="fr-FR"/>
-        </w:rPr>
-        <w:t>learning</w:t>
-      </w:r>
-      <w:proofErr w:type="spellEnd"/>
-      <w:r>
-        <w:rPr>
-          <w:rFonts w:ascii="Times New Roman" w:hAnsi="Times New Roman" w:cs="Times New Roman"/>
-          <w:lang w:val="fr-FR"/>
-        </w:rPr>
-        <w:t xml:space="preserve"> a pour particularité de </w:t>
-      </w:r>
-      <w:r>
-        <w:rPr>
-          <w:rFonts w:ascii="Times New Roman" w:hAnsi="Times New Roman" w:cs="Times New Roman"/>
-          <w:b/>
-          <w:bCs/>
-          <w:lang w:val="fr-FR"/>
-        </w:rPr>
-        <w:t>construire automatiquement des représentations</w:t>
-      </w:r>
-      <w:r>
-        <w:rPr>
-          <w:rFonts w:ascii="Times New Roman" w:hAnsi="Times New Roman" w:cs="Times New Roman"/>
-          <w:lang w:val="fr-FR"/>
-        </w:rPr>
-        <w:t xml:space="preserve"> des données à partir d’exemples. Toutefois, la performance d’un réseau ne dépend pas uniquement de sa capacité : elle dépend surtout de l’</w:t>
-      </w:r>
-      <w:r>
-        <w:rPr>
-          <w:rFonts w:ascii="Times New Roman" w:hAnsi="Times New Roman" w:cs="Times New Roman"/>
-          <w:b/>
-          <w:bCs/>
-          <w:lang w:val="fr-FR"/>
-        </w:rPr>
-        <w:t>adéquation entre son architecture et la structure statistique des données</w:t>
-      </w:r>
-      <w:r>
-        <w:rPr>
-          <w:rFonts w:ascii="Times New Roman" w:hAnsi="Times New Roman" w:cs="Times New Roman"/>
-          <w:lang w:val="fr-FR"/>
-        </w:rPr>
-        <w:t xml:space="preserve">. Ce projet illustre cette idée sur trois familles de données radicalement différentes — </w:t>
-      </w:r>
-      <w:r>
-        <w:rPr>
-          <w:rFonts w:ascii="Times New Roman" w:hAnsi="Times New Roman" w:cs="Times New Roman"/>
-          <w:b/>
-          <w:bCs/>
-          <w:lang w:val="fr-FR"/>
-        </w:rPr>
-        <w:t>tabulaire</w:t>
-      </w:r>
-      <w:r>
-        <w:rPr>
-          <w:rFonts w:ascii="Times New Roman" w:hAnsi="Times New Roman" w:cs="Times New Roman"/>
-          <w:lang w:val="fr-FR"/>
-        </w:rPr>
-        <w:t xml:space="preserve">, </w:t>
-      </w:r>
-      <w:r>
-        <w:rPr>
-          <w:rFonts w:ascii="Times New Roman" w:hAnsi="Times New Roman" w:cs="Times New Roman"/>
-          <w:b/>
-          <w:bCs/>
-          <w:lang w:val="fr-FR"/>
-        </w:rPr>
-        <w:t>image</w:t>
-      </w:r>
-      <w:r>
-        <w:rPr>
-          <w:rFonts w:ascii="Times New Roman" w:hAnsi="Times New Roman" w:cs="Times New Roman"/>
-          <w:lang w:val="fr-FR"/>
-        </w:rPr>
-        <w:t xml:space="preserve"> et </w:t>
-      </w:r>
-      <w:r>
-        <w:rPr>
-          <w:rFonts w:ascii="Times New Roman" w:hAnsi="Times New Roman" w:cs="Times New Roman"/>
-          <w:b/>
-          <w:bCs/>
-          <w:lang w:val="fr-FR"/>
-        </w:rPr>
-        <w:t>séquentielle</w:t>
-      </w:r>
-      <w:r>
-        <w:rPr>
-          <w:rFonts w:ascii="Times New Roman" w:hAnsi="Times New Roman" w:cs="Times New Roman"/>
-          <w:lang w:val="fr-FR"/>
-        </w:rPr>
-        <w:t xml:space="preserve"> — en concevant, entraînant et comparant les architectures correspondantes sous </w:t>
-      </w:r>
-      <w:proofErr w:type="spellStart"/>
-      <w:r>
-        <w:rPr>
-          <w:rFonts w:ascii="Times New Roman" w:hAnsi="Times New Roman" w:cs="Times New Roman"/>
-          <w:lang w:val="fr-FR"/>
-        </w:rPr>
-        <w:t>PyTorch</w:t>
-      </w:r>
-      <w:proofErr w:type="spellEnd"/>
-      <w:r>
-        <w:rPr>
-          <w:rFonts w:ascii="Times New Roman" w:hAnsi="Times New Roman" w:cs="Times New Roman"/>
-          <w:lang w:val="fr-FR"/>
-        </w:rPr>
-        <w:t>.</w:t>
-      </w:r>
-    </w:p>
-    <w:p>
-      <w:pPr>
-        <w:pStyle w:val="BodyText"/>
-        <w:rPr>
-          <w:rFonts w:ascii="Times New Roman" w:hAnsi="Times New Roman" w:cs="Times New Roman"/>
-          <w:lang w:val="fr-FR"/>
-        </w:rPr>
-      </w:pPr>
-      <w:r>
-        <w:rPr>
-          <w:rFonts w:ascii="Times New Roman" w:hAnsi="Times New Roman" w:cs="Times New Roman"/>
-          <w:lang w:val="fr-FR"/>
-        </w:rPr>
-        <w:t>Le travail est strictement individuel et organisé en trois parties indépendantes mais cohérentes, chacune comportant une étude théorique, une implémentation, une étude expérimentale, une analyse critique et une question de synthèse sur un jeu de données réel.</w:t>
-      </w:r>
-    </w:p>
-    <w:p>
-      <w:pPr>
-        <w:pStyle w:val="Heading2"/>
-        <w:rPr>
-          <w:rFonts w:ascii="Times New Roman" w:hAnsi="Times New Roman" w:cs="Times New Roman"/>
-        </w:rPr>
-      </w:pPr>
-      <w:bookmarkStart w:id="7" w:name="objectifs"/>
-      <w:bookmarkStart w:id="8" w:name="_Toc232519540"/>
-      <w:bookmarkEnd w:id="5"/>
       <w:r>
         <w:rPr>
           <w:rFonts w:ascii="Times New Roman" w:hAnsi="Times New Roman" w:cs="Times New Roman"/>
         </w:rPr>
         <w:t>2. Objectifs</w:t>
       </w:r>
-      <w:bookmarkEnd w:id="8"/>
+      <w:bookmarkEnd w:id="7"/>
     </w:p>
     <w:p>
       <w:pPr>
@@ -5226,9 +5172,9 @@
           <w:lang w:val="fr-FR"/>
         </w:rPr>
       </w:pPr>
-      <w:bookmarkStart w:id="9" w:name="méthodologie-générale"/>
-      <w:bookmarkStart w:id="10" w:name="_Toc232519541"/>
-      <w:bookmarkEnd w:id="7"/>
+      <w:bookmarkStart w:id="9" w:name="_Toc232519541"/>
+      <w:bookmarkStart w:id="10" w:name="méthodologie-générale"/>
+      <w:bookmarkEnd w:id="8"/>
       <w:r>
         <w:rPr>
           <w:rFonts w:ascii="Times New Roman" w:hAnsi="Times New Roman" w:cs="Times New Roman"/>
@@ -5236,7 +5182,7 @@
         </w:rPr>
         <w:t>3. Méthodologie générale</w:t>
       </w:r>
-      <w:bookmarkEnd w:id="10"/>
+      <w:bookmarkEnd w:id="9"/>
     </w:p>
     <w:p>
       <w:pPr>
@@ -6169,9 +6115,9 @@
           <w:lang w:val="fr-FR"/>
         </w:rPr>
       </w:pPr>
-      <w:bookmarkStart w:id="13" w:name="Xe1f3899765d296489ee2cbc2eb6fb02066a0383"/>
-      <w:bookmarkStart w:id="14" w:name="_Toc232519542"/>
-      <w:bookmarkEnd w:id="9"/>
+      <w:bookmarkStart w:id="13" w:name="_Toc232519542"/>
+      <w:bookmarkStart w:id="14" w:name="Xe1f3899765d296489ee2cbc2eb6fb02066a0383"/>
+      <w:bookmarkEnd w:id="10"/>
       <w:bookmarkEnd w:id="12"/>
       <w:r>
         <w:rPr>
@@ -6197,7 +6143,7 @@
         </w:rPr>
         <w:t>)</w:t>
       </w:r>
-      <w:bookmarkEnd w:id="14"/>
+      <w:bookmarkEnd w:id="13"/>
     </w:p>
     <w:p>
       <w:pPr>
@@ -8377,9 +8323,9 @@
           <w:lang w:val="fr-FR"/>
         </w:rPr>
       </w:pPr>
-      <w:bookmarkStart w:id="24" w:name="Xcdf77fe6b6946d88c5d9feb0ee5a1393c92af14"/>
-      <w:bookmarkStart w:id="25" w:name="_Toc232519543"/>
-      <w:bookmarkEnd w:id="13"/>
+      <w:bookmarkStart w:id="24" w:name="_Toc232519543"/>
+      <w:bookmarkStart w:id="25" w:name="Xcdf77fe6b6946d88c5d9feb0ee5a1393c92af14"/>
+      <w:bookmarkEnd w:id="14"/>
       <w:bookmarkEnd w:id="23"/>
       <w:r>
         <w:rPr>
@@ -8389,7 +8335,7 @@
         <w:lastRenderedPageBreak/>
         <w:t>5. Partie II — CNN et vision par ordinateur (CIFAR-10)</w:t>
       </w:r>
-      <w:bookmarkEnd w:id="25"/>
+      <w:bookmarkEnd w:id="24"/>
     </w:p>
     <w:p>
       <w:pPr>
@@ -9793,55 +9739,7 @@
           <w:rFonts w:ascii="Times New Roman" w:hAnsi="Times New Roman" w:cs="Times New Roman"/>
           <w:lang w:val="fr-FR"/>
         </w:rPr>
-        <w:t xml:space="preserve"> - Etude </w:t>
-      </w:r>
-      <w:proofErr w:type="spellStart"/>
-      <w:r>
-        <w:rPr>
-          <w:rFonts w:ascii="Times New Roman" w:hAnsi="Times New Roman" w:cs="Times New Roman"/>
-          <w:lang w:val="fr-FR"/>
-        </w:rPr>
-        <w:t>d'ablation</w:t>
-      </w:r>
-      <w:proofErr w:type="spellEnd"/>
-      <w:r>
-        <w:rPr>
-          <w:rFonts w:ascii="Times New Roman" w:hAnsi="Times New Roman" w:cs="Times New Roman"/>
-          <w:lang w:val="fr-FR"/>
-        </w:rPr>
-        <w:t xml:space="preserve"> : </w:t>
-      </w:r>
-      <w:proofErr w:type="spellStart"/>
-      <w:r>
-        <w:rPr>
-          <w:rFonts w:ascii="Times New Roman" w:hAnsi="Times New Roman" w:cs="Times New Roman"/>
-          <w:lang w:val="fr-FR"/>
-        </w:rPr>
-        <w:t>effet</w:t>
-      </w:r>
-      <w:proofErr w:type="spellEnd"/>
-      <w:r>
-        <w:rPr>
-          <w:rFonts w:ascii="Times New Roman" w:hAnsi="Times New Roman" w:cs="Times New Roman"/>
-          <w:lang w:val="fr-FR"/>
-        </w:rPr>
-        <w:t xml:space="preserve"> des choix </w:t>
-      </w:r>
-      <w:proofErr w:type="spellStart"/>
-      <w:r>
-        <w:rPr>
-          <w:rFonts w:ascii="Times New Roman" w:hAnsi="Times New Roman" w:cs="Times New Roman"/>
-          <w:lang w:val="fr-FR"/>
-        </w:rPr>
-        <w:t>architecturaux</w:t>
-      </w:r>
-      <w:proofErr w:type="spellEnd"/>
-      <w:r>
-        <w:rPr>
-          <w:rFonts w:ascii="Times New Roman" w:hAnsi="Times New Roman" w:cs="Times New Roman"/>
-          <w:lang w:val="fr-FR"/>
-        </w:rPr>
-        <w:t xml:space="preserve"> du CNN sur CIFAR-10 (</w:t>
+        <w:t xml:space="preserve"> - Etude d'ablation : effet des choix architecturaux du CNN sur CIFAR-10 (</w:t>
       </w:r>
       <w:proofErr w:type="spellStart"/>
       <w:r>
@@ -10105,23 +10003,7 @@
           <w:rFonts w:ascii="Times New Roman" w:hAnsi="Times New Roman" w:cs="Times New Roman"/>
           <w:lang w:val="fr-FR"/>
         </w:rPr>
-        <w:t xml:space="preserve"> - Cartes de </w:t>
-      </w:r>
-      <w:proofErr w:type="spellStart"/>
-      <w:r>
-        <w:rPr>
-          <w:rFonts w:ascii="Times New Roman" w:hAnsi="Times New Roman" w:cs="Times New Roman"/>
-          <w:lang w:val="fr-FR"/>
-        </w:rPr>
-        <w:t>caractéristiques</w:t>
-      </w:r>
-      <w:proofErr w:type="spellEnd"/>
-      <w:r>
-        <w:rPr>
-          <w:rFonts w:ascii="Times New Roman" w:hAnsi="Times New Roman" w:cs="Times New Roman"/>
-          <w:lang w:val="fr-FR"/>
-        </w:rPr>
-        <w:t xml:space="preserve"> du premier bloc </w:t>
+        <w:t xml:space="preserve"> - Cartes de caractéristiques du premier bloc </w:t>
       </w:r>
       <w:proofErr w:type="spellStart"/>
       <w:r>
@@ -10286,23 +10168,7 @@
           <w:rFonts w:ascii="Times New Roman" w:hAnsi="Times New Roman" w:cs="Times New Roman"/>
           <w:lang w:val="fr-FR"/>
         </w:rPr>
-        <w:t xml:space="preserve"> - MLP vs CNN sur les </w:t>
-      </w:r>
-      <w:proofErr w:type="spellStart"/>
-      <w:r>
-        <w:rPr>
-          <w:rFonts w:ascii="Times New Roman" w:hAnsi="Times New Roman" w:cs="Times New Roman"/>
-          <w:lang w:val="fr-FR"/>
-        </w:rPr>
-        <w:t>mêmes</w:t>
-      </w:r>
-      <w:proofErr w:type="spellEnd"/>
-      <w:r>
-        <w:rPr>
-          <w:rFonts w:ascii="Times New Roman" w:hAnsi="Times New Roman" w:cs="Times New Roman"/>
-          <w:lang w:val="fr-FR"/>
-        </w:rPr>
-        <w:t xml:space="preserve"> données.</w:t>
+        <w:t xml:space="preserve"> - MLP vs CNN sur les mêmes données.</w:t>
       </w:r>
       <w:bookmarkEnd w:id="32"/>
     </w:p>
@@ -10555,7 +10421,7 @@
           <w:rFonts w:ascii="Times New Roman" w:hAnsi="Times New Roman" w:cs="Times New Roman"/>
           <w:lang w:val="fr-FR"/>
         </w:rPr>
-        <w:t xml:space="preserve"> - </w:t>
+        <w:t xml:space="preserve"> - Comparaison MLP vs CNN sur CIFAR-10 (</w:t>
       </w:r>
       <w:proofErr w:type="spellStart"/>
       <w:r>
@@ -10563,7 +10429,7 @@
           <w:rFonts w:ascii="Times New Roman" w:hAnsi="Times New Roman" w:cs="Times New Roman"/>
           <w:lang w:val="fr-FR"/>
         </w:rPr>
-        <w:t>Comparaison</w:t>
+        <w:t>accuracy</w:t>
       </w:r>
       <w:proofErr w:type="spellEnd"/>
       <w:r>
@@ -10571,39 +10437,7 @@
           <w:rFonts w:ascii="Times New Roman" w:hAnsi="Times New Roman" w:cs="Times New Roman"/>
           <w:lang w:val="fr-FR"/>
         </w:rPr>
-        <w:t xml:space="preserve"> MLP vs CNN sur CIFAR-10 (accuracy de test, </w:t>
-      </w:r>
-      <w:proofErr w:type="spellStart"/>
-      <w:r>
-        <w:rPr>
-          <w:rFonts w:ascii="Times New Roman" w:hAnsi="Times New Roman" w:cs="Times New Roman"/>
-          <w:lang w:val="fr-FR"/>
-        </w:rPr>
-        <w:t>mêmes</w:t>
-      </w:r>
-      <w:proofErr w:type="spellEnd"/>
-      <w:r>
-        <w:rPr>
-          <w:rFonts w:ascii="Times New Roman" w:hAnsi="Times New Roman" w:cs="Times New Roman"/>
-          <w:lang w:val="fr-FR"/>
-        </w:rPr>
-        <w:t xml:space="preserve"> données et </w:t>
-      </w:r>
-      <w:proofErr w:type="spellStart"/>
-      <w:r>
-        <w:rPr>
-          <w:rFonts w:ascii="Times New Roman" w:hAnsi="Times New Roman" w:cs="Times New Roman"/>
-          <w:lang w:val="fr-FR"/>
-        </w:rPr>
-        <w:t>mêmes</w:t>
-      </w:r>
-      <w:proofErr w:type="spellEnd"/>
-      <w:r>
-        <w:rPr>
-          <w:rFonts w:ascii="Times New Roman" w:hAnsi="Times New Roman" w:cs="Times New Roman"/>
-          <w:lang w:val="fr-FR"/>
-        </w:rPr>
-        <w:t xml:space="preserve"> époques)</w:t>
+        <w:t xml:space="preserve"> de test, mêmes données et mêmes époques)</w:t>
       </w:r>
       <w:bookmarkEnd w:id="33"/>
     </w:p>
@@ -10720,6 +10554,7 @@
         <w:pStyle w:val="FirstParagraph"/>
         <w:rPr>
           <w:rFonts w:ascii="Times New Roman" w:hAnsi="Times New Roman" w:cs="Times New Roman"/>
+          <w:lang w:val="fr-FR"/>
         </w:rPr>
       </w:pPr>
       <w:r>
@@ -10895,126 +10730,112 @@
       <w:r>
         <w:rPr>
           <w:rFonts w:ascii="Times New Roman" w:hAnsi="Times New Roman" w:cs="Times New Roman"/>
-        </w:rPr>
-        <w:t xml:space="preserve">Les ablations </w:t>
+          <w:lang w:val="fr-FR"/>
+        </w:rPr>
+        <w:t>Les ablations confirment que ces choix déplacent réellement l’</w:t>
       </w:r>
       <w:proofErr w:type="spellStart"/>
       <w:r>
         <w:rPr>
           <w:rFonts w:ascii="Times New Roman" w:hAnsi="Times New Roman" w:cs="Times New Roman"/>
-        </w:rPr>
-        <w:t>confirment</w:t>
+          <w:lang w:val="fr-FR"/>
+        </w:rPr>
+        <w:t>accuracy</w:t>
       </w:r>
       <w:proofErr w:type="spellEnd"/>
       <w:r>
         <w:rPr>
           <w:rFonts w:ascii="Times New Roman" w:hAnsi="Times New Roman" w:cs="Times New Roman"/>
-        </w:rPr>
-        <w:t xml:space="preserve"> </w:t>
-      </w:r>
-      <w:proofErr w:type="spellStart"/>
-      <w:r>
-        <w:rPr>
-          <w:rFonts w:ascii="Times New Roman" w:hAnsi="Times New Roman" w:cs="Times New Roman"/>
-        </w:rPr>
-        <w:t>que</w:t>
-      </w:r>
-      <w:proofErr w:type="spellEnd"/>
-      <w:r>
-        <w:rPr>
-          <w:rFonts w:ascii="Times New Roman" w:hAnsi="Times New Roman" w:cs="Times New Roman"/>
-        </w:rPr>
-        <w:t xml:space="preserve"> </w:t>
-      </w:r>
-      <w:proofErr w:type="spellStart"/>
-      <w:r>
-        <w:rPr>
-          <w:rFonts w:ascii="Times New Roman" w:hAnsi="Times New Roman" w:cs="Times New Roman"/>
-        </w:rPr>
-        <w:t>ces</w:t>
-      </w:r>
-      <w:proofErr w:type="spellEnd"/>
-      <w:r>
-        <w:rPr>
-          <w:rFonts w:ascii="Times New Roman" w:hAnsi="Times New Roman" w:cs="Times New Roman"/>
-        </w:rPr>
-        <w:t xml:space="preserve"> choix déplacent réellement l’accuracy.</w:t>
-      </w:r>
-    </w:p>
-    <w:p>
-      <w:pPr>
-        <w:rPr>
-          <w:rFonts w:ascii="Times New Roman" w:hAnsi="Times New Roman" w:cs="Times New Roman"/>
-        </w:rPr>
-      </w:pPr>
-    </w:p>
-    <w:p>
-      <w:pPr>
-        <w:rPr>
-          <w:rFonts w:ascii="Times New Roman" w:hAnsi="Times New Roman" w:cs="Times New Roman"/>
-        </w:rPr>
-      </w:pPr>
-    </w:p>
-    <w:p>
-      <w:pPr>
-        <w:rPr>
-          <w:rFonts w:ascii="Times New Roman" w:hAnsi="Times New Roman" w:cs="Times New Roman"/>
-        </w:rPr>
-      </w:pPr>
-    </w:p>
-    <w:p>
-      <w:pPr>
-        <w:rPr>
-          <w:rFonts w:ascii="Times New Roman" w:hAnsi="Times New Roman" w:cs="Times New Roman"/>
-        </w:rPr>
-      </w:pPr>
-    </w:p>
-    <w:p>
-      <w:pPr>
-        <w:rPr>
-          <w:rFonts w:ascii="Times New Roman" w:hAnsi="Times New Roman" w:cs="Times New Roman"/>
-        </w:rPr>
-      </w:pPr>
-    </w:p>
-    <w:p>
-      <w:pPr>
-        <w:rPr>
-          <w:rFonts w:ascii="Times New Roman" w:hAnsi="Times New Roman" w:cs="Times New Roman"/>
-        </w:rPr>
-      </w:pPr>
-    </w:p>
-    <w:p>
-      <w:pPr>
-        <w:rPr>
-          <w:rFonts w:ascii="Times New Roman" w:hAnsi="Times New Roman" w:cs="Times New Roman"/>
-        </w:rPr>
-      </w:pPr>
-    </w:p>
-    <w:p>
-      <w:pPr>
-        <w:rPr>
-          <w:rFonts w:ascii="Times New Roman" w:hAnsi="Times New Roman" w:cs="Times New Roman"/>
-        </w:rPr>
-      </w:pPr>
-    </w:p>
-    <w:p>
-      <w:pPr>
-        <w:rPr>
-          <w:rFonts w:ascii="Times New Roman" w:hAnsi="Times New Roman" w:cs="Times New Roman"/>
-        </w:rPr>
-      </w:pPr>
-    </w:p>
-    <w:p>
-      <w:pPr>
-        <w:rPr>
-          <w:rFonts w:ascii="Times New Roman" w:hAnsi="Times New Roman" w:cs="Times New Roman"/>
-        </w:rPr>
-      </w:pPr>
-    </w:p>
-    <w:p>
-      <w:pPr>
-        <w:rPr>
-          <w:rFonts w:ascii="Times New Roman" w:hAnsi="Times New Roman" w:cs="Times New Roman"/>
+          <w:lang w:val="fr-FR"/>
+        </w:rPr>
+        <w:t>.</w:t>
+      </w:r>
+    </w:p>
+    <w:p>
+      <w:pPr>
+        <w:rPr>
+          <w:rFonts w:ascii="Times New Roman" w:hAnsi="Times New Roman" w:cs="Times New Roman"/>
+          <w:lang w:val="fr-FR"/>
+        </w:rPr>
+      </w:pPr>
+    </w:p>
+    <w:p>
+      <w:pPr>
+        <w:rPr>
+          <w:rFonts w:ascii="Times New Roman" w:hAnsi="Times New Roman" w:cs="Times New Roman"/>
+          <w:lang w:val="fr-FR"/>
+        </w:rPr>
+      </w:pPr>
+    </w:p>
+    <w:p>
+      <w:pPr>
+        <w:rPr>
+          <w:rFonts w:ascii="Times New Roman" w:hAnsi="Times New Roman" w:cs="Times New Roman"/>
+          <w:lang w:val="fr-FR"/>
+        </w:rPr>
+      </w:pPr>
+    </w:p>
+    <w:p>
+      <w:pPr>
+        <w:rPr>
+          <w:rFonts w:ascii="Times New Roman" w:hAnsi="Times New Roman" w:cs="Times New Roman"/>
+          <w:lang w:val="fr-FR"/>
+        </w:rPr>
+      </w:pPr>
+    </w:p>
+    <w:p>
+      <w:pPr>
+        <w:rPr>
+          <w:rFonts w:ascii="Times New Roman" w:hAnsi="Times New Roman" w:cs="Times New Roman"/>
+          <w:lang w:val="fr-FR"/>
+        </w:rPr>
+      </w:pPr>
+    </w:p>
+    <w:p>
+      <w:pPr>
+        <w:rPr>
+          <w:rFonts w:ascii="Times New Roman" w:hAnsi="Times New Roman" w:cs="Times New Roman"/>
+          <w:lang w:val="fr-FR"/>
+        </w:rPr>
+      </w:pPr>
+    </w:p>
+    <w:p>
+      <w:pPr>
+        <w:rPr>
+          <w:rFonts w:ascii="Times New Roman" w:hAnsi="Times New Roman" w:cs="Times New Roman"/>
+          <w:lang w:val="fr-FR"/>
+        </w:rPr>
+      </w:pPr>
+    </w:p>
+    <w:p>
+      <w:pPr>
+        <w:rPr>
+          <w:rFonts w:ascii="Times New Roman" w:hAnsi="Times New Roman" w:cs="Times New Roman"/>
+          <w:lang w:val="fr-FR"/>
+        </w:rPr>
+      </w:pPr>
+    </w:p>
+    <w:p>
+      <w:pPr>
+        <w:rPr>
+          <w:rFonts w:ascii="Times New Roman" w:hAnsi="Times New Roman" w:cs="Times New Roman"/>
+          <w:lang w:val="fr-FR"/>
+        </w:rPr>
+      </w:pPr>
+    </w:p>
+    <w:p>
+      <w:pPr>
+        <w:rPr>
+          <w:rFonts w:ascii="Times New Roman" w:hAnsi="Times New Roman" w:cs="Times New Roman"/>
+          <w:lang w:val="fr-FR"/>
+        </w:rPr>
+      </w:pPr>
+    </w:p>
+    <w:p>
+      <w:pPr>
+        <w:rPr>
+          <w:rFonts w:ascii="Times New Roman" w:hAnsi="Times New Roman" w:cs="Times New Roman"/>
+          <w:lang w:val="fr-FR"/>
         </w:rPr>
       </w:pPr>
     </w:p>
@@ -11026,9 +10847,9 @@
           <w:lang w:val="fr-FR"/>
         </w:rPr>
       </w:pPr>
-      <w:bookmarkStart w:id="35" w:name="X42f97a65be610db30043d5e4ba1ee2fa660d0ba"/>
-      <w:bookmarkStart w:id="36" w:name="_Toc232519544"/>
-      <w:bookmarkEnd w:id="24"/>
+      <w:bookmarkStart w:id="35" w:name="_Toc232519544"/>
+      <w:bookmarkStart w:id="36" w:name="X42f97a65be610db30043d5e4ba1ee2fa660d0ba"/>
+      <w:bookmarkEnd w:id="25"/>
       <w:bookmarkEnd w:id="34"/>
       <w:r>
         <w:rPr>
@@ -11070,7 +10891,7 @@
         </w:rPr>
         <w:t>)</w:t>
       </w:r>
-      <w:bookmarkEnd w:id="36"/>
+      <w:bookmarkEnd w:id="35"/>
     </w:p>
     <w:p>
       <w:pPr>
@@ -11847,23 +11668,7 @@
           <w:rFonts w:ascii="Times New Roman" w:hAnsi="Times New Roman" w:cs="Times New Roman"/>
           <w:lang w:val="fr-FR"/>
         </w:rPr>
-        <w:t xml:space="preserve"> - </w:t>
-      </w:r>
-      <w:proofErr w:type="spellStart"/>
-      <w:r>
-        <w:rPr>
-          <w:rFonts w:ascii="Times New Roman" w:hAnsi="Times New Roman" w:cs="Times New Roman"/>
-          <w:lang w:val="fr-FR"/>
-        </w:rPr>
-        <w:t>Perplexité</w:t>
-      </w:r>
-      <w:proofErr w:type="spellEnd"/>
-      <w:r>
-        <w:rPr>
-          <w:rFonts w:ascii="Times New Roman" w:hAnsi="Times New Roman" w:cs="Times New Roman"/>
-          <w:lang w:val="fr-FR"/>
-        </w:rPr>
-        <w:t xml:space="preserve"> de validation (plus bas = mieux).</w:t>
+        <w:t xml:space="preserve"> - Perplexité de validation (plus bas = mieux).</w:t>
       </w:r>
       <w:bookmarkEnd w:id="40"/>
     </w:p>
@@ -12240,39 +12045,7 @@
           <w:rFonts w:ascii="Times New Roman" w:hAnsi="Times New Roman" w:cs="Times New Roman"/>
           <w:lang w:val="fr-FR"/>
         </w:rPr>
-        <w:t xml:space="preserve"> - </w:t>
-      </w:r>
-      <w:proofErr w:type="spellStart"/>
-      <w:r>
-        <w:rPr>
-          <w:rFonts w:ascii="Times New Roman" w:hAnsi="Times New Roman" w:cs="Times New Roman"/>
-          <w:lang w:val="fr-FR"/>
-        </w:rPr>
-        <w:t>Perplexité</w:t>
-      </w:r>
-      <w:proofErr w:type="spellEnd"/>
-      <w:r>
-        <w:rPr>
-          <w:rFonts w:ascii="Times New Roman" w:hAnsi="Times New Roman" w:cs="Times New Roman"/>
-          <w:lang w:val="fr-FR"/>
-        </w:rPr>
-        <w:t xml:space="preserve"> de validation (plus bas = </w:t>
-      </w:r>
-      <w:proofErr w:type="spellStart"/>
-      <w:r>
-        <w:rPr>
-          <w:rFonts w:ascii="Times New Roman" w:hAnsi="Times New Roman" w:cs="Times New Roman"/>
-          <w:lang w:val="fr-FR"/>
-        </w:rPr>
-        <w:t>mieux</w:t>
-      </w:r>
-      <w:proofErr w:type="spellEnd"/>
-      <w:r>
-        <w:rPr>
-          <w:rFonts w:ascii="Times New Roman" w:hAnsi="Times New Roman" w:cs="Times New Roman"/>
-          <w:lang w:val="fr-FR"/>
-        </w:rPr>
-        <w:t>).</w:t>
+        <w:t xml:space="preserve"> - Perplexité de validation (plus bas = mieux).</w:t>
       </w:r>
       <w:bookmarkEnd w:id="41"/>
     </w:p>
@@ -12421,7 +12194,7 @@
           <w:rFonts w:ascii="Times New Roman" w:hAnsi="Times New Roman" w:cs="Times New Roman"/>
           <w:lang w:val="fr-FR"/>
         </w:rPr>
-        <w:t xml:space="preserve"> - </w:t>
+        <w:t xml:space="preserve"> - Effet du gradient </w:t>
       </w:r>
       <w:proofErr w:type="spellStart"/>
       <w:r>
@@ -12429,7 +12202,7 @@
           <w:rFonts w:ascii="Times New Roman" w:hAnsi="Times New Roman" w:cs="Times New Roman"/>
           <w:lang w:val="fr-FR"/>
         </w:rPr>
-        <w:t>Effet</w:t>
+        <w:t>clipping</w:t>
       </w:r>
       <w:proofErr w:type="spellEnd"/>
       <w:r>
@@ -12437,23 +12210,7 @@
           <w:rFonts w:ascii="Times New Roman" w:hAnsi="Times New Roman" w:cs="Times New Roman"/>
           <w:lang w:val="fr-FR"/>
         </w:rPr>
-        <w:t xml:space="preserve"> du gradient clipping (RNN simple, SGD, </w:t>
-      </w:r>
-      <w:proofErr w:type="spellStart"/>
-      <w:r>
-        <w:rPr>
-          <w:rFonts w:ascii="Times New Roman" w:hAnsi="Times New Roman" w:cs="Times New Roman"/>
-          <w:lang w:val="fr-FR"/>
-        </w:rPr>
-        <w:t>échelle</w:t>
-      </w:r>
-      <w:proofErr w:type="spellEnd"/>
-      <w:r>
-        <w:rPr>
-          <w:rFonts w:ascii="Times New Roman" w:hAnsi="Times New Roman" w:cs="Times New Roman"/>
-          <w:lang w:val="fr-FR"/>
-        </w:rPr>
-        <w:t xml:space="preserve"> log).</w:t>
+        <w:t xml:space="preserve"> (RNN simple, SGD, échelle log).</w:t>
       </w:r>
       <w:bookmarkEnd w:id="42"/>
     </w:p>
@@ -13279,7 +13036,7 @@
           <w:rFonts w:ascii="Times New Roman" w:hAnsi="Times New Roman" w:cs="Times New Roman"/>
           <w:lang w:val="fr-FR"/>
         </w:rPr>
-        <w:t xml:space="preserve"> - </w:t>
+        <w:t xml:space="preserve"> - Comparaison des stratégies de décodage du Seq2Seq : glouton vs </w:t>
       </w:r>
       <w:proofErr w:type="spellStart"/>
       <w:r>
@@ -13287,7 +13044,7 @@
           <w:rFonts w:ascii="Times New Roman" w:hAnsi="Times New Roman" w:cs="Times New Roman"/>
           <w:lang w:val="fr-FR"/>
         </w:rPr>
-        <w:t>Comparaison</w:t>
+        <w:t>beam</w:t>
       </w:r>
       <w:proofErr w:type="spellEnd"/>
       <w:r>
@@ -13295,7 +13052,7 @@
           <w:rFonts w:ascii="Times New Roman" w:hAnsi="Times New Roman" w:cs="Times New Roman"/>
           <w:lang w:val="fr-FR"/>
         </w:rPr>
-        <w:t xml:space="preserve"> des </w:t>
+        <w:t xml:space="preserve"> </w:t>
       </w:r>
       <w:proofErr w:type="spellStart"/>
       <w:r>
@@ -13303,7 +13060,7 @@
           <w:rFonts w:ascii="Times New Roman" w:hAnsi="Times New Roman" w:cs="Times New Roman"/>
           <w:lang w:val="fr-FR"/>
         </w:rPr>
-        <w:t>stratégies</w:t>
+        <w:t>search</w:t>
       </w:r>
       <w:proofErr w:type="spellEnd"/>
       <w:r>
@@ -13311,55 +13068,7 @@
           <w:rFonts w:ascii="Times New Roman" w:hAnsi="Times New Roman" w:cs="Times New Roman"/>
           <w:lang w:val="fr-FR"/>
         </w:rPr>
-        <w:t xml:space="preserve"> de </w:t>
-      </w:r>
-      <w:proofErr w:type="spellStart"/>
-      <w:r>
-        <w:rPr>
-          <w:rFonts w:ascii="Times New Roman" w:hAnsi="Times New Roman" w:cs="Times New Roman"/>
-          <w:lang w:val="fr-FR"/>
-        </w:rPr>
-        <w:t>décodage</w:t>
-      </w:r>
-      <w:proofErr w:type="spellEnd"/>
-      <w:r>
-        <w:rPr>
-          <w:rFonts w:ascii="Times New Roman" w:hAnsi="Times New Roman" w:cs="Times New Roman"/>
-          <w:lang w:val="fr-FR"/>
-        </w:rPr>
-        <w:t xml:space="preserve"> du Seq2</w:t>
-      </w:r>
-      <w:proofErr w:type="gramStart"/>
-      <w:r>
-        <w:rPr>
-          <w:rFonts w:ascii="Times New Roman" w:hAnsi="Times New Roman" w:cs="Times New Roman"/>
-          <w:lang w:val="fr-FR"/>
-        </w:rPr>
-        <w:t>Seq :</w:t>
-      </w:r>
-      <w:proofErr w:type="gramEnd"/>
-      <w:r>
-        <w:rPr>
-          <w:rFonts w:ascii="Times New Roman" w:hAnsi="Times New Roman" w:cs="Times New Roman"/>
-          <w:lang w:val="fr-FR"/>
-        </w:rPr>
-        <w:t xml:space="preserve"> </w:t>
-      </w:r>
-      <w:proofErr w:type="spellStart"/>
-      <w:r>
-        <w:rPr>
-          <w:rFonts w:ascii="Times New Roman" w:hAnsi="Times New Roman" w:cs="Times New Roman"/>
-          <w:lang w:val="fr-FR"/>
-        </w:rPr>
-        <w:t>glouton</w:t>
-      </w:r>
-      <w:proofErr w:type="spellEnd"/>
-      <w:r>
-        <w:rPr>
-          <w:rFonts w:ascii="Times New Roman" w:hAnsi="Times New Roman" w:cs="Times New Roman"/>
-          <w:lang w:val="fr-FR"/>
-        </w:rPr>
-        <w:t xml:space="preserve"> vs beam search (BLEU moyen sur validation)</w:t>
+        <w:t xml:space="preserve"> (BLEU moyen sur validation)</w:t>
       </w:r>
       <w:bookmarkEnd w:id="46"/>
     </w:p>
@@ -13996,9 +13705,9 @@
           <w:lang w:val="fr-FR"/>
         </w:rPr>
       </w:pPr>
-      <w:bookmarkStart w:id="48" w:name="synthèse-transversale"/>
-      <w:bookmarkStart w:id="49" w:name="_Toc232519545"/>
-      <w:bookmarkEnd w:id="35"/>
+      <w:bookmarkStart w:id="48" w:name="_Toc232519545"/>
+      <w:bookmarkStart w:id="49" w:name="synthèse-transversale"/>
+      <w:bookmarkEnd w:id="36"/>
       <w:bookmarkEnd w:id="47"/>
       <w:r>
         <w:rPr>
@@ -14008,7 +13717,7 @@
         <w:lastRenderedPageBreak/>
         <w:t>7. Synthèse transversale</w:t>
       </w:r>
-      <w:bookmarkEnd w:id="49"/>
+      <w:bookmarkEnd w:id="48"/>
     </w:p>
     <w:p>
       <w:pPr>
@@ -14713,64 +14422,7 @@
           <w:rFonts w:ascii="Times New Roman" w:hAnsi="Times New Roman" w:cs="Times New Roman"/>
           <w:lang w:val="fr-FR"/>
         </w:rPr>
-        <w:t xml:space="preserve"> - </w:t>
-      </w:r>
-      <w:proofErr w:type="spellStart"/>
-      <w:r>
-        <w:rPr>
-          <w:rFonts w:ascii="Times New Roman" w:hAnsi="Times New Roman" w:cs="Times New Roman"/>
-          <w:lang w:val="fr-FR"/>
-        </w:rPr>
-        <w:t>Synthèse</w:t>
-      </w:r>
-      <w:proofErr w:type="spellEnd"/>
-      <w:r>
-        <w:rPr>
-          <w:rFonts w:ascii="Times New Roman" w:hAnsi="Times New Roman" w:cs="Times New Roman"/>
-          <w:lang w:val="fr-FR"/>
-        </w:rPr>
-        <w:t xml:space="preserve"> </w:t>
-      </w:r>
-      <w:proofErr w:type="spellStart"/>
-      <w:proofErr w:type="gramStart"/>
-      <w:r>
-        <w:rPr>
-          <w:rFonts w:ascii="Times New Roman" w:hAnsi="Times New Roman" w:cs="Times New Roman"/>
-          <w:lang w:val="fr-FR"/>
-        </w:rPr>
-        <w:t>transversale</w:t>
-      </w:r>
-      <w:proofErr w:type="spellEnd"/>
-      <w:r>
-        <w:rPr>
-          <w:rFonts w:ascii="Times New Roman" w:hAnsi="Times New Roman" w:cs="Times New Roman"/>
-          <w:lang w:val="fr-FR"/>
-        </w:rPr>
-        <w:t xml:space="preserve"> :</w:t>
-      </w:r>
-      <w:proofErr w:type="gramEnd"/>
-      <w:r>
-        <w:rPr>
-          <w:rFonts w:ascii="Times New Roman" w:hAnsi="Times New Roman" w:cs="Times New Roman"/>
-          <w:lang w:val="fr-FR"/>
-        </w:rPr>
-        <w:t xml:space="preserve"> </w:t>
-      </w:r>
-      <w:proofErr w:type="spellStart"/>
-      <w:r>
-        <w:rPr>
-          <w:rFonts w:ascii="Times New Roman" w:hAnsi="Times New Roman" w:cs="Times New Roman"/>
-          <w:lang w:val="fr-FR"/>
-        </w:rPr>
-        <w:t>adéquation</w:t>
-      </w:r>
-      <w:proofErr w:type="spellEnd"/>
-      <w:r>
-        <w:rPr>
-          <w:rFonts w:ascii="Times New Roman" w:hAnsi="Times New Roman" w:cs="Times New Roman"/>
-          <w:lang w:val="fr-FR"/>
-        </w:rPr>
-        <w:t xml:space="preserve"> entre architecture et structure des données</w:t>
+        <w:t xml:space="preserve"> - Synthèse transversale : adéquation entre architecture et structure des données</w:t>
       </w:r>
       <w:bookmarkEnd w:id="50"/>
     </w:p>
@@ -14966,16 +14618,16 @@
           <w:rFonts w:ascii="Times New Roman" w:hAnsi="Times New Roman" w:cs="Times New Roman"/>
         </w:rPr>
       </w:pPr>
-      <w:bookmarkStart w:id="51" w:name="limites"/>
-      <w:bookmarkStart w:id="52" w:name="_Toc232519546"/>
-      <w:bookmarkEnd w:id="48"/>
+      <w:bookmarkStart w:id="51" w:name="_Toc232519546"/>
+      <w:bookmarkStart w:id="52" w:name="limites"/>
+      <w:bookmarkEnd w:id="49"/>
       <w:r>
         <w:rPr>
           <w:rFonts w:ascii="Times New Roman" w:hAnsi="Times New Roman" w:cs="Times New Roman"/>
         </w:rPr>
         <w:t>8. Limites</w:t>
       </w:r>
-      <w:bookmarkEnd w:id="52"/>
+      <w:bookmarkEnd w:id="51"/>
     </w:p>
     <w:p>
       <w:pPr>
@@ -15196,9 +14848,9 @@
           <w:lang w:val="fr-FR"/>
         </w:rPr>
       </w:pPr>
-      <w:bookmarkStart w:id="53" w:name="conclusion"/>
-      <w:bookmarkStart w:id="54" w:name="_Toc232519547"/>
-      <w:bookmarkEnd w:id="51"/>
+      <w:bookmarkStart w:id="53" w:name="_Toc232519547"/>
+      <w:bookmarkStart w:id="54" w:name="conclusion"/>
+      <w:bookmarkEnd w:id="52"/>
       <w:r>
         <w:rPr>
           <w:rFonts w:ascii="Times New Roman" w:hAnsi="Times New Roman" w:cs="Times New Roman"/>
@@ -15207,217 +14859,217 @@
         <w:lastRenderedPageBreak/>
         <w:t>9. Conclusion</w:t>
       </w:r>
+      <w:bookmarkEnd w:id="53"/>
+    </w:p>
+    <w:p>
+      <w:pPr>
+        <w:pStyle w:val="FirstParagraph"/>
+        <w:rPr>
+          <w:rFonts w:ascii="Times New Roman" w:hAnsi="Times New Roman" w:cs="Times New Roman"/>
+          <w:lang w:val="fr-FR"/>
+        </w:rPr>
+      </w:pPr>
+      <w:r>
+        <w:rPr>
+          <w:rFonts w:ascii="Times New Roman" w:hAnsi="Times New Roman" w:cs="Times New Roman"/>
+          <w:lang w:val="fr-FR"/>
+        </w:rPr>
+        <w:t xml:space="preserve">Ce projet a couvert, de bout en bout et sous </w:t>
+      </w:r>
+      <w:proofErr w:type="spellStart"/>
+      <w:r>
+        <w:rPr>
+          <w:rFonts w:ascii="Times New Roman" w:hAnsi="Times New Roman" w:cs="Times New Roman"/>
+          <w:lang w:val="fr-FR"/>
+        </w:rPr>
+        <w:t>PyTorch</w:t>
+      </w:r>
+      <w:proofErr w:type="spellEnd"/>
+      <w:r>
+        <w:rPr>
+          <w:rFonts w:ascii="Times New Roman" w:hAnsi="Times New Roman" w:cs="Times New Roman"/>
+          <w:lang w:val="fr-FR"/>
+        </w:rPr>
+        <w:t xml:space="preserve">, les trois grandes familles d’architectures du module : MLP (tabulaire), CNN (image) et RNN/LSTM/GRU/Seq2Seq (séquence). Pour chacune, l’étude théorique, l’implémentation rigoureuse (deux versions du MLP, opérations </w:t>
+      </w:r>
+      <w:proofErr w:type="spellStart"/>
+      <w:r>
+        <w:rPr>
+          <w:rFonts w:ascii="Times New Roman" w:hAnsi="Times New Roman" w:cs="Times New Roman"/>
+          <w:lang w:val="fr-FR"/>
+        </w:rPr>
+        <w:t>convolutionnelles</w:t>
+      </w:r>
+      <w:proofErr w:type="spellEnd"/>
+      <w:r>
+        <w:rPr>
+          <w:rFonts w:ascii="Times New Roman" w:hAnsi="Times New Roman" w:cs="Times New Roman"/>
+          <w:lang w:val="fr-FR"/>
+        </w:rPr>
+        <w:t xml:space="preserve"> réimplémentées et validées contre </w:t>
+      </w:r>
+      <w:proofErr w:type="spellStart"/>
+      <w:r>
+        <w:rPr>
+          <w:rFonts w:ascii="Times New Roman" w:hAnsi="Times New Roman" w:cs="Times New Roman"/>
+          <w:lang w:val="fr-FR"/>
+        </w:rPr>
+        <w:t>PyTorch</w:t>
+      </w:r>
+      <w:proofErr w:type="spellEnd"/>
+      <w:r>
+        <w:rPr>
+          <w:rFonts w:ascii="Times New Roman" w:hAnsi="Times New Roman" w:cs="Times New Roman"/>
+          <w:lang w:val="fr-FR"/>
+        </w:rPr>
+        <w:t xml:space="preserve">, comparaison des cellules récurrentes, système Seq2Seq avec </w:t>
+      </w:r>
+      <w:proofErr w:type="spellStart"/>
+      <w:r>
+        <w:rPr>
+          <w:rFonts w:ascii="Times New Roman" w:hAnsi="Times New Roman" w:cs="Times New Roman"/>
+          <w:lang w:val="fr-FR"/>
+        </w:rPr>
+        <w:t>beam</w:t>
+      </w:r>
+      <w:proofErr w:type="spellEnd"/>
+      <w:r>
+        <w:rPr>
+          <w:rFonts w:ascii="Times New Roman" w:hAnsi="Times New Roman" w:cs="Times New Roman"/>
+          <w:lang w:val="fr-FR"/>
+        </w:rPr>
+        <w:t xml:space="preserve"> </w:t>
+      </w:r>
+      <w:proofErr w:type="spellStart"/>
+      <w:r>
+        <w:rPr>
+          <w:rFonts w:ascii="Times New Roman" w:hAnsi="Times New Roman" w:cs="Times New Roman"/>
+          <w:lang w:val="fr-FR"/>
+        </w:rPr>
+        <w:t>search</w:t>
+      </w:r>
+      <w:proofErr w:type="spellEnd"/>
+      <w:r>
+        <w:rPr>
+          <w:rFonts w:ascii="Times New Roman" w:hAnsi="Times New Roman" w:cs="Times New Roman"/>
+          <w:lang w:val="fr-FR"/>
+        </w:rPr>
+        <w:t>) et les expériences contrôlées ont permis d’</w:t>
+      </w:r>
+      <w:r>
+        <w:rPr>
+          <w:rFonts w:ascii="Times New Roman" w:hAnsi="Times New Roman" w:cs="Times New Roman"/>
+          <w:b/>
+          <w:bCs/>
+          <w:lang w:val="fr-FR"/>
+        </w:rPr>
+        <w:t>illustrer concrètement</w:t>
+      </w:r>
+      <w:r>
+        <w:rPr>
+          <w:rFonts w:ascii="Times New Roman" w:hAnsi="Times New Roman" w:cs="Times New Roman"/>
+          <w:lang w:val="fr-FR"/>
+        </w:rPr>
+        <w:t xml:space="preserve"> le principe directeur : </w:t>
+      </w:r>
+      <w:r>
+        <w:rPr>
+          <w:rFonts w:ascii="Times New Roman" w:hAnsi="Times New Roman" w:cs="Times New Roman"/>
+          <w:b/>
+          <w:bCs/>
+          <w:lang w:val="fr-FR"/>
+        </w:rPr>
+        <w:t xml:space="preserve">l’efficacité d’un modèle de </w:t>
+      </w:r>
+      <w:proofErr w:type="spellStart"/>
+      <w:r>
+        <w:rPr>
+          <w:rFonts w:ascii="Times New Roman" w:hAnsi="Times New Roman" w:cs="Times New Roman"/>
+          <w:b/>
+          <w:bCs/>
+          <w:lang w:val="fr-FR"/>
+        </w:rPr>
+        <w:t>deep</w:t>
+      </w:r>
+      <w:proofErr w:type="spellEnd"/>
+      <w:r>
+        <w:rPr>
+          <w:rFonts w:ascii="Times New Roman" w:hAnsi="Times New Roman" w:cs="Times New Roman"/>
+          <w:b/>
+          <w:bCs/>
+          <w:lang w:val="fr-FR"/>
+        </w:rPr>
+        <w:t xml:space="preserve"> </w:t>
+      </w:r>
+      <w:proofErr w:type="spellStart"/>
+      <w:r>
+        <w:rPr>
+          <w:rFonts w:ascii="Times New Roman" w:hAnsi="Times New Roman" w:cs="Times New Roman"/>
+          <w:b/>
+          <w:bCs/>
+          <w:lang w:val="fr-FR"/>
+        </w:rPr>
+        <w:t>learning</w:t>
+      </w:r>
+      <w:proofErr w:type="spellEnd"/>
+      <w:r>
+        <w:rPr>
+          <w:rFonts w:ascii="Times New Roman" w:hAnsi="Times New Roman" w:cs="Times New Roman"/>
+          <w:b/>
+          <w:bCs/>
+          <w:lang w:val="fr-FR"/>
+        </w:rPr>
+        <w:t xml:space="preserve"> provient de l’adéquation entre son biais inductif et la structure statistique des données</w:t>
+      </w:r>
+      <w:r>
+        <w:rPr>
+          <w:rFonts w:ascii="Times New Roman" w:hAnsi="Times New Roman" w:cs="Times New Roman"/>
+          <w:lang w:val="fr-FR"/>
+        </w:rPr>
+        <w:t xml:space="preserve">. Les résultats — CNN </w:t>
+      </w:r>
+      <w:r>
+        <w:rPr>
+          <w:rFonts w:ascii="Cambria Math" w:hAnsi="Cambria Math" w:cs="Cambria Math"/>
+          <w:lang w:val="fr-FR"/>
+        </w:rPr>
+        <w:t>≫</w:t>
+      </w:r>
+      <w:r>
+        <w:rPr>
+          <w:rFonts w:ascii="Times New Roman" w:hAnsi="Times New Roman" w:cs="Times New Roman"/>
+          <w:lang w:val="fr-FR"/>
+        </w:rPr>
+        <w:t xml:space="preserve"> MLP sur l’image, LSTM/GRU &gt; RNN sur la séquence, </w:t>
+      </w:r>
+      <w:proofErr w:type="spellStart"/>
+      <w:r>
+        <w:rPr>
+          <w:rFonts w:ascii="Times New Roman" w:hAnsi="Times New Roman" w:cs="Times New Roman"/>
+          <w:lang w:val="fr-FR"/>
+        </w:rPr>
+        <w:t>beam</w:t>
+      </w:r>
+      <w:proofErr w:type="spellEnd"/>
+      <w:r>
+        <w:rPr>
+          <w:rFonts w:ascii="Times New Roman" w:hAnsi="Times New Roman" w:cs="Times New Roman"/>
+          <w:lang w:val="fr-FR"/>
+        </w:rPr>
+        <w:t xml:space="preserve"> ≥ glouton au décodage — confirment expérimentalement la théorie et répondent aux questions de synthèse de chaque partie ainsi qu’à la problématique transversale.</w:t>
+      </w:r>
+    </w:p>
+    <w:p>
+      <w:pPr>
+        <w:pStyle w:val="Heading2"/>
+        <w:rPr>
+          <w:rFonts w:ascii="Times New Roman" w:hAnsi="Times New Roman" w:cs="Times New Roman"/>
+          <w:lang w:val="fr-FR"/>
+        </w:rPr>
+      </w:pPr>
+      <w:bookmarkStart w:id="55" w:name="_Toc232519548"/>
+      <w:bookmarkStart w:id="56" w:name="annexe-expérimentale"/>
       <w:bookmarkEnd w:id="54"/>
-    </w:p>
-    <w:p>
-      <w:pPr>
-        <w:pStyle w:val="FirstParagraph"/>
-        <w:rPr>
-          <w:rFonts w:ascii="Times New Roman" w:hAnsi="Times New Roman" w:cs="Times New Roman"/>
-          <w:lang w:val="fr-FR"/>
-        </w:rPr>
-      </w:pPr>
-      <w:r>
-        <w:rPr>
-          <w:rFonts w:ascii="Times New Roman" w:hAnsi="Times New Roman" w:cs="Times New Roman"/>
-          <w:lang w:val="fr-FR"/>
-        </w:rPr>
-        <w:t xml:space="preserve">Ce projet a couvert, de bout en bout et sous </w:t>
-      </w:r>
-      <w:proofErr w:type="spellStart"/>
-      <w:r>
-        <w:rPr>
-          <w:rFonts w:ascii="Times New Roman" w:hAnsi="Times New Roman" w:cs="Times New Roman"/>
-          <w:lang w:val="fr-FR"/>
-        </w:rPr>
-        <w:t>PyTorch</w:t>
-      </w:r>
-      <w:proofErr w:type="spellEnd"/>
-      <w:r>
-        <w:rPr>
-          <w:rFonts w:ascii="Times New Roman" w:hAnsi="Times New Roman" w:cs="Times New Roman"/>
-          <w:lang w:val="fr-FR"/>
-        </w:rPr>
-        <w:t xml:space="preserve">, les trois grandes familles d’architectures du module : MLP (tabulaire), CNN (image) et RNN/LSTM/GRU/Seq2Seq (séquence). Pour chacune, l’étude théorique, l’implémentation rigoureuse (deux versions du MLP, opérations </w:t>
-      </w:r>
-      <w:proofErr w:type="spellStart"/>
-      <w:r>
-        <w:rPr>
-          <w:rFonts w:ascii="Times New Roman" w:hAnsi="Times New Roman" w:cs="Times New Roman"/>
-          <w:lang w:val="fr-FR"/>
-        </w:rPr>
-        <w:t>convolutionnelles</w:t>
-      </w:r>
-      <w:proofErr w:type="spellEnd"/>
-      <w:r>
-        <w:rPr>
-          <w:rFonts w:ascii="Times New Roman" w:hAnsi="Times New Roman" w:cs="Times New Roman"/>
-          <w:lang w:val="fr-FR"/>
-        </w:rPr>
-        <w:t xml:space="preserve"> réimplémentées et validées contre </w:t>
-      </w:r>
-      <w:proofErr w:type="spellStart"/>
-      <w:r>
-        <w:rPr>
-          <w:rFonts w:ascii="Times New Roman" w:hAnsi="Times New Roman" w:cs="Times New Roman"/>
-          <w:lang w:val="fr-FR"/>
-        </w:rPr>
-        <w:t>PyTorch</w:t>
-      </w:r>
-      <w:proofErr w:type="spellEnd"/>
-      <w:r>
-        <w:rPr>
-          <w:rFonts w:ascii="Times New Roman" w:hAnsi="Times New Roman" w:cs="Times New Roman"/>
-          <w:lang w:val="fr-FR"/>
-        </w:rPr>
-        <w:t xml:space="preserve">, comparaison des cellules récurrentes, système Seq2Seq avec </w:t>
-      </w:r>
-      <w:proofErr w:type="spellStart"/>
-      <w:r>
-        <w:rPr>
-          <w:rFonts w:ascii="Times New Roman" w:hAnsi="Times New Roman" w:cs="Times New Roman"/>
-          <w:lang w:val="fr-FR"/>
-        </w:rPr>
-        <w:t>beam</w:t>
-      </w:r>
-      <w:proofErr w:type="spellEnd"/>
-      <w:r>
-        <w:rPr>
-          <w:rFonts w:ascii="Times New Roman" w:hAnsi="Times New Roman" w:cs="Times New Roman"/>
-          <w:lang w:val="fr-FR"/>
-        </w:rPr>
-        <w:t xml:space="preserve"> </w:t>
-      </w:r>
-      <w:proofErr w:type="spellStart"/>
-      <w:r>
-        <w:rPr>
-          <w:rFonts w:ascii="Times New Roman" w:hAnsi="Times New Roman" w:cs="Times New Roman"/>
-          <w:lang w:val="fr-FR"/>
-        </w:rPr>
-        <w:t>search</w:t>
-      </w:r>
-      <w:proofErr w:type="spellEnd"/>
-      <w:r>
-        <w:rPr>
-          <w:rFonts w:ascii="Times New Roman" w:hAnsi="Times New Roman" w:cs="Times New Roman"/>
-          <w:lang w:val="fr-FR"/>
-        </w:rPr>
-        <w:t>) et les expériences contrôlées ont permis d’</w:t>
-      </w:r>
-      <w:r>
-        <w:rPr>
-          <w:rFonts w:ascii="Times New Roman" w:hAnsi="Times New Roman" w:cs="Times New Roman"/>
-          <w:b/>
-          <w:bCs/>
-          <w:lang w:val="fr-FR"/>
-        </w:rPr>
-        <w:t>illustrer concrètement</w:t>
-      </w:r>
-      <w:r>
-        <w:rPr>
-          <w:rFonts w:ascii="Times New Roman" w:hAnsi="Times New Roman" w:cs="Times New Roman"/>
-          <w:lang w:val="fr-FR"/>
-        </w:rPr>
-        <w:t xml:space="preserve"> le principe directeur : </w:t>
-      </w:r>
-      <w:r>
-        <w:rPr>
-          <w:rFonts w:ascii="Times New Roman" w:hAnsi="Times New Roman" w:cs="Times New Roman"/>
-          <w:b/>
-          <w:bCs/>
-          <w:lang w:val="fr-FR"/>
-        </w:rPr>
-        <w:t xml:space="preserve">l’efficacité d’un modèle de </w:t>
-      </w:r>
-      <w:proofErr w:type="spellStart"/>
-      <w:r>
-        <w:rPr>
-          <w:rFonts w:ascii="Times New Roman" w:hAnsi="Times New Roman" w:cs="Times New Roman"/>
-          <w:b/>
-          <w:bCs/>
-          <w:lang w:val="fr-FR"/>
-        </w:rPr>
-        <w:t>deep</w:t>
-      </w:r>
-      <w:proofErr w:type="spellEnd"/>
-      <w:r>
-        <w:rPr>
-          <w:rFonts w:ascii="Times New Roman" w:hAnsi="Times New Roman" w:cs="Times New Roman"/>
-          <w:b/>
-          <w:bCs/>
-          <w:lang w:val="fr-FR"/>
-        </w:rPr>
-        <w:t xml:space="preserve"> </w:t>
-      </w:r>
-      <w:proofErr w:type="spellStart"/>
-      <w:r>
-        <w:rPr>
-          <w:rFonts w:ascii="Times New Roman" w:hAnsi="Times New Roman" w:cs="Times New Roman"/>
-          <w:b/>
-          <w:bCs/>
-          <w:lang w:val="fr-FR"/>
-        </w:rPr>
-        <w:t>learning</w:t>
-      </w:r>
-      <w:proofErr w:type="spellEnd"/>
-      <w:r>
-        <w:rPr>
-          <w:rFonts w:ascii="Times New Roman" w:hAnsi="Times New Roman" w:cs="Times New Roman"/>
-          <w:b/>
-          <w:bCs/>
-          <w:lang w:val="fr-FR"/>
-        </w:rPr>
-        <w:t xml:space="preserve"> provient de l’adéquation entre son biais inductif et la structure statistique des données</w:t>
-      </w:r>
-      <w:r>
-        <w:rPr>
-          <w:rFonts w:ascii="Times New Roman" w:hAnsi="Times New Roman" w:cs="Times New Roman"/>
-          <w:lang w:val="fr-FR"/>
-        </w:rPr>
-        <w:t xml:space="preserve">. Les résultats — CNN </w:t>
-      </w:r>
-      <w:r>
-        <w:rPr>
-          <w:rFonts w:ascii="Cambria Math" w:hAnsi="Cambria Math" w:cs="Cambria Math"/>
-          <w:lang w:val="fr-FR"/>
-        </w:rPr>
-        <w:t>≫</w:t>
-      </w:r>
-      <w:r>
-        <w:rPr>
-          <w:rFonts w:ascii="Times New Roman" w:hAnsi="Times New Roman" w:cs="Times New Roman"/>
-          <w:lang w:val="fr-FR"/>
-        </w:rPr>
-        <w:t xml:space="preserve"> MLP sur l’image, LSTM/GRU &gt; RNN sur la séquence, </w:t>
-      </w:r>
-      <w:proofErr w:type="spellStart"/>
-      <w:r>
-        <w:rPr>
-          <w:rFonts w:ascii="Times New Roman" w:hAnsi="Times New Roman" w:cs="Times New Roman"/>
-          <w:lang w:val="fr-FR"/>
-        </w:rPr>
-        <w:t>beam</w:t>
-      </w:r>
-      <w:proofErr w:type="spellEnd"/>
-      <w:r>
-        <w:rPr>
-          <w:rFonts w:ascii="Times New Roman" w:hAnsi="Times New Roman" w:cs="Times New Roman"/>
-          <w:lang w:val="fr-FR"/>
-        </w:rPr>
-        <w:t xml:space="preserve"> ≥ glouton au décodage — confirment expérimentalement la théorie et répondent aux questions de synthèse de chaque partie ainsi qu’à la problématique transversale.</w:t>
-      </w:r>
-    </w:p>
-    <w:p>
-      <w:pPr>
-        <w:pStyle w:val="Heading2"/>
-        <w:rPr>
-          <w:rFonts w:ascii="Times New Roman" w:hAnsi="Times New Roman" w:cs="Times New Roman"/>
-          <w:lang w:val="fr-FR"/>
-        </w:rPr>
-      </w:pPr>
-      <w:bookmarkStart w:id="55" w:name="annexe-expérimentale"/>
-      <w:bookmarkStart w:id="56" w:name="_Toc232519548"/>
-      <w:bookmarkEnd w:id="53"/>
       <w:r>
         <w:rPr>
           <w:rFonts w:ascii="Times New Roman" w:hAnsi="Times New Roman" w:cs="Times New Roman"/>
@@ -15425,7 +15077,7 @@
         </w:rPr>
         <w:t>10. Annexe expérimentale</w:t>
       </w:r>
-      <w:bookmarkEnd w:id="56"/>
+      <w:bookmarkEnd w:id="55"/>
     </w:p>
     <w:p>
       <w:pPr>
@@ -15813,7 +15465,7 @@
         <w:t>.</w:t>
       </w:r>
       <w:bookmarkEnd w:id="0"/>
-      <w:bookmarkEnd w:id="55"/>
+      <w:bookmarkEnd w:id="56"/>
     </w:p>
     <w:p>
       <w:pPr>
@@ -17571,7 +17223,7 @@
         <w:color w:val="555555"/>
         <w:sz w:val="18"/>
         <w:szCs w:val="22"/>
-        <w:lang w:eastAsia="en-US"/>
+        <w:lang w:val="fr-FR" w:eastAsia="en-US"/>
       </w:rPr>
     </w:pPr>
     <w:r>
@@ -17580,63 +17232,9 @@
         <w:color w:val="555555"/>
         <w:sz w:val="18"/>
         <w:szCs w:val="22"/>
-        <w:lang w:eastAsia="en-US"/>
+        <w:lang w:val="fr-FR" w:eastAsia="en-US"/>
       </w:rPr>
-      <w:t xml:space="preserve">Projet de fin de module </w:t>
-    </w:r>
-    <w:proofErr w:type="spellStart"/>
-    <w:r>
-      <w:rPr>
-        <w:rFonts w:ascii="Times New Roman" w:hAnsi="Times New Roman"/>
-        <w:color w:val="555555"/>
-        <w:sz w:val="18"/>
-        <w:szCs w:val="22"/>
-        <w:lang w:eastAsia="en-US"/>
-      </w:rPr>
-      <w:t>deep</w:t>
-    </w:r>
-    <w:proofErr w:type="spellEnd"/>
-    <w:r>
-      <w:rPr>
-        <w:rFonts w:ascii="Times New Roman" w:hAnsi="Times New Roman"/>
-        <w:color w:val="555555"/>
-        <w:sz w:val="18"/>
-        <w:szCs w:val="22"/>
-        <w:lang w:eastAsia="en-US"/>
-      </w:rPr>
-      <w:t xml:space="preserve"> </w:t>
-    </w:r>
-    <w:proofErr w:type="spellStart"/>
-    <w:r>
-      <w:rPr>
-        <w:rFonts w:ascii="Times New Roman" w:hAnsi="Times New Roman"/>
-        <w:color w:val="555555"/>
-        <w:sz w:val="18"/>
-        <w:szCs w:val="22"/>
-        <w:lang w:eastAsia="en-US"/>
-      </w:rPr>
-      <w:t>learning</w:t>
-    </w:r>
-    <w:proofErr w:type="spellEnd"/>
-    <w:r>
-      <w:rPr>
-        <w:rFonts w:ascii="Times New Roman" w:hAnsi="Times New Roman"/>
-        <w:color w:val="555555"/>
-        <w:sz w:val="18"/>
-        <w:szCs w:val="22"/>
-        <w:lang w:eastAsia="en-US"/>
-      </w:rPr>
-      <w:t xml:space="preserve"> - </w:t>
-    </w:r>
-    <w:r>
-      <w:rPr>
-        <w:rFonts w:ascii="Times New Roman" w:hAnsi="Times New Roman"/>
-        <w:color w:val="555555"/>
-        <w:sz w:val="18"/>
-        <w:szCs w:val="22"/>
-        <w:lang w:eastAsia="en-US"/>
-      </w:rPr>
-      <w:t>Année universitaire 2025–2026</w:t>
+      <w:t>Projet de fin de module deep learning - Année universitaire 2025–2026</w:t>
     </w:r>
   </w:p>
   <w:p>
@@ -18599,6 +18197,7 @@
   <w:style w:type="character" w:default="1" w:styleId="DefaultParagraphFont">
     <w:name w:val="Default Paragraph Font"/>
     <w:uiPriority w:val="1"/>
+    <w:semiHidden/>
     <w:unhideWhenUsed/>
   </w:style>
   <w:style w:type="table" w:default="1" w:styleId="TableNormal">

</xml_diff>